<commit_message>
Fix LP and LG page footers left at v2.0
The section footer runs are outside the paragraph pass, so every page
still printed "· C364 · v2.0". Rewrote the footer runs and re-exported
both PDFs.

Co-Authored-By: Claude Opus 5 <noreply@anthropic.com>
</commit_message>
<xml_diff>
--- a/courseware/LG-Generative AI for Script Development and Storytelling-v1.0.docx
+++ b/courseware/LG-Generative AI for Script Development and Storytelling-v1.0.docx
@@ -2207,6 +2207,8 @@
     <w:sectPr>
       <w:footerReference w:type="default" r:id="rId10"/>
       <w:headerReference w:type="default" r:id="rId11"/>
+      <w:footerReference w:type="even" r:id="rId12"/>
+      <w:footerReference w:type="first" r:id="rId13"/>
       <w:pgSz w:w="12240" w:h="15840"/>
       <w:pgMar w:top="1008" w:right="1152" w:bottom="936" w:left="1152" w:header="648" w:footer="576" w:gutter="0"/>
       <w:cols w:space="720"/>
@@ -2223,11 +2225,31 @@
       <w:pStyle w:val="Footer"/>
     </w:pPr>
     <w:r>
-      <w:t xml:space="preserve">© 2026 Tertiary Infotech Academy Pte Ltd · C364 · v2.0 · Page  of </w:t>
+      <w:t xml:space="preserve">© 2026 Tertiary Infotech Academy Pte Ltd · C364 · v1.0 · Page  of </w:t>
     </w:r>
     <w:fldSimple w:instr="PAGE"/>
     <w:r/>
     <w:fldSimple w:instr="NUMPAGES"/>
+  </w:p>
+</w:ftr>
+</file>
+
+<file path=word/footer2.xml><?xml version="1.0" encoding="utf-8"?>
+<w:ftr xmlns:m="http://schemas.openxmlformats.org/officeDocument/2006/math" xmlns:mc="http://schemas.openxmlformats.org/markup-compatibility/2006" xmlns:mo="http://schemas.microsoft.com/office/mac/office/2008/main" xmlns:mv="urn:schemas-microsoft-com:mac:vml" xmlns:o="urn:schemas-microsoft-com:office:office" xmlns:r="http://schemas.openxmlformats.org/officeDocument/2006/relationships" xmlns:v="urn:schemas-microsoft-com:vml" xmlns:w10="urn:schemas-microsoft-com:office:word" xmlns:w14="http://schemas.microsoft.com/office/word/2010/wordml" xmlns:w="http://schemas.openxmlformats.org/wordprocessingml/2006/main" xmlns:wne="http://schemas.microsoft.com/office/word/2006/wordml" xmlns:wp14="http://schemas.microsoft.com/office/word/2010/wordprocessingDrawing" xmlns:wp="http://schemas.openxmlformats.org/drawingml/2006/wordprocessingDrawing" xmlns:wpc="http://schemas.microsoft.com/office/word/2010/wordprocessingCanvas" xmlns:wpg="http://schemas.microsoft.com/office/word/2010/wordprocessingGroup" xmlns:wpi="http://schemas.microsoft.com/office/word/2010/wordprocessingInk" xmlns:wps="http://schemas.microsoft.com/office/word/2010/wordprocessingShape" mc:Ignorable="w14 wp14">
+  <w:p>
+    <w:pPr>
+      <w:pStyle w:val="Footer"/>
+    </w:pPr>
+  </w:p>
+</w:ftr>
+</file>
+
+<file path=word/footer3.xml><?xml version="1.0" encoding="utf-8"?>
+<w:ftr xmlns:m="http://schemas.openxmlformats.org/officeDocument/2006/math" xmlns:mc="http://schemas.openxmlformats.org/markup-compatibility/2006" xmlns:mo="http://schemas.microsoft.com/office/mac/office/2008/main" xmlns:mv="urn:schemas-microsoft-com:mac:vml" xmlns:o="urn:schemas-microsoft-com:office:office" xmlns:r="http://schemas.openxmlformats.org/officeDocument/2006/relationships" xmlns:v="urn:schemas-microsoft-com:vml" xmlns:w10="urn:schemas-microsoft-com:office:word" xmlns:w14="http://schemas.microsoft.com/office/word/2010/wordml" xmlns:w="http://schemas.openxmlformats.org/wordprocessingml/2006/main" xmlns:wne="http://schemas.microsoft.com/office/word/2006/wordml" xmlns:wp14="http://schemas.microsoft.com/office/word/2010/wordprocessingDrawing" xmlns:wp="http://schemas.openxmlformats.org/drawingml/2006/wordprocessingDrawing" xmlns:wpc="http://schemas.microsoft.com/office/word/2010/wordprocessingCanvas" xmlns:wpg="http://schemas.microsoft.com/office/word/2010/wordprocessingGroup" xmlns:wpi="http://schemas.microsoft.com/office/word/2010/wordprocessingInk" xmlns:wps="http://schemas.microsoft.com/office/word/2010/wordprocessingShape" mc:Ignorable="w14 wp14">
+  <w:p>
+    <w:pPr>
+      <w:pStyle w:val="Footer"/>
+    </w:pPr>
   </w:p>
 </w:ftr>
 </file>

</xml_diff>